<commit_message>
docs(personas): clarify APP_PASSWORD + update all docs/tests for 5-persona lineup (v2.18.6)
- app/README.md: clarify APP_PASSWORD is one shared password for all personas
- app/.env.example: add comment that all personas share the same password
- tests/playwright/README.md:
  - Fix "Aravind Doma" → "Asin D"
  - Add Priya Nair to personas table with gate assignment
  - Add APP_PASSWORD shared-password note
- tests/playwright/auth.spec.js:
  - AUTH-01: "4 persona cards" → "5 persona cards", HaveCount(4) → HaveCount(5)
  - AUTH-05: "All 4 personas" → "All 5 personas"
  - AUTH-05 iterates PERSONAS array which already includes Priya Nair
- ICT_Test_Plan_v2.18.docx:
  - Test personas row: add Priya Nair
  - AUTH-01/05: 4 → 5 personas, add Priya Nair to card list
  - Gate reviewer assignments: Priya=Gate 1, James=Gate 2, Sarah=Gate 3

Co-Authored-By: Claude Sonnet 4.6 <noreply@anthropic.com>
</commit_message>
<xml_diff>
--- a/ICT_Test_Plan_v2.18.docx
+++ b/ICT_Test_Plan_v2.18.docx
@@ -399,7 +399,7 @@
                 <w:sz w:val="20"/>
                 <w:szCs w:val="20"/>
               </w:rPr>
-              <w:t xml:space="preserve">Asin D, Sarah Chen, James Park, Maya Patel</w:t>
+              <w:t xml:space="preserve">Asin D, Priya Nair, James Park, Sarah Chen, Maya Patel</w:t>
             </w:r>
           </w:p>
         </w:tc>
@@ -1623,7 +1623,7 @@
                 <w:sz w:val="19"/>
                 <w:szCs w:val="19"/>
               </w:rPr>
-              <w:t xml:space="preserve">Page shows 4 persona cards (Asin D, Sarah Chen, James Park, Maya Patel) each with initials avatar and role. Password field and "Sign in →" button visible.</w:t>
+              <w:t xml:space="preserve">Page shows 5 persona cards (Asin D, Priya Nair, James Park, Sarah Chen, Maya Patel) each with initials avatar and role. Password field and "Sign in →" button visible.</w:t>
             </w:r>
           </w:p>
         </w:tc>
@@ -1756,7 +1756,7 @@
                 <w:sz w:val="19"/>
                 <w:szCs w:val="19"/>
               </w:rPr>
-              <w:t xml:space="preserve">1. Click each of the 4 persona cards in turn</w:t>
+              <w:t xml:space="preserve">1. Click each of the 5 persona cards in turn</w:t>
             </w:r>
           </w:p>
           <w:p>
@@ -2289,7 +2289,7 @@
                 <w:sz w:val="20"/>
                 <w:szCs w:val="20"/>
               </w:rPr>
-              <w:t xml:space="preserve">All 4 personas can log in</w:t>
+              <w:t xml:space="preserve">All 5 personas can log in</w:t>
             </w:r>
           </w:p>
         </w:tc>
@@ -2321,7 +2321,7 @@
                 <w:sz w:val="19"/>
                 <w:szCs w:val="19"/>
               </w:rPr>
-              <w:t xml:space="preserve">1. Repeat AUTH-03 for each persona: Asin D, Sarah Chen, James Park, Maya Patel</w:t>
+              <w:t xml:space="preserve">1. Repeat AUTH-03 for each persona: Asin D, Priya Nair, James Park, Sarah Chen, Maya Patel</w:t>
             </w:r>
           </w:p>
           <w:p>
@@ -2367,7 +2367,7 @@
                 <w:sz w:val="19"/>
                 <w:szCs w:val="19"/>
               </w:rPr>
-              <w:t xml:space="preserve">Each persona logs in successfully. persona cookie matches selected name. Nav chip and sidebar footer show correct name and role for each.</w:t>
+              <w:t xml:space="preserve">Each of the 5 personas logs in successfully. persona cookie matches selected name. Nav chip and sidebar footer show correct name and role for each. Gate assignments visible in role label (Gate 1 / 2 / 3 for Priya / James / Sarah).</w:t>
             </w:r>
           </w:p>
         </w:tc>
@@ -8857,7 +8857,7 @@
                 <w:sz w:val="19"/>
                 <w:szCs w:val="19"/>
               </w:rPr>
-              <w:t xml:space="preserve">3. Enter reviewer name (e.g. "Sarah Chen")</w:t>
+              <w:t xml:space="preserve">3. Enter reviewer name (e.g. "Priya Nair")</w:t>
             </w:r>
           </w:p>
           <w:p>
@@ -10054,7 +10054,7 @@
                 <w:sz w:val="19"/>
                 <w:szCs w:val="19"/>
               </w:rPr>
-              <w:t xml:space="preserve">2. Approve via Review Queue with reviewer "Maya Patel"</w:t>
+              <w:t xml:space="preserve">2. Approve via Review Queue with reviewer "Sarah Chen"</w:t>
             </w:r>
           </w:p>
         </w:tc>

</xml_diff>